<commit_message>
Refactor beat layouts to dynamic pages, update license docs, and UI styling
</commit_message>
<xml_diff>
--- a/public/licenses/basic-mp3-license.docx
+++ b/public/licenses/basic-mp3-license.docx
@@ -642,6 +642,23 @@
     </w:p>
     <w:p>
       <w:pPr>
+        <w:spacing w:after="160" w:line="276"/>
+        <w:jc w:val="both"/>
+      </w:pPr>
+      <w:r>
+        <w:rPr>
+          <w:rFonts w:ascii="Calibri" w:cs="Calibri" w:eastAsia="Calibri" w:hAnsi="Calibri"/>
+          <w:b w:val="false"/>
+          <w:bCs w:val="false"/>
+          <w:color w:val="1A1A1A"/>
+          <w:sz w:val="21"/>
+          <w:szCs w:val="21"/>
+        </w:rPr>
+        <w:t xml:space="preserve">If the Licensee exceeds any of the distribution or streaming caps set forth in this Section, the Licensee must immediately upgrade to a higher tier license or remove the New Song from all distribution channels, streaming platforms, and video platforms.</w:t>
+      </w:r>
+    </w:p>
+    <w:p>
+      <w:pPr>
         <w:spacing w:after="120" w:before="260"/>
       </w:pPr>
       <w:r>
@@ -736,7 +753,7 @@
           <w:sz w:val="21"/>
           <w:szCs w:val="21"/>
         </w:rPr>
-        <w:t xml:space="preserve">Synchronize the Beat or the New Song with any audiovisual work other than the one (1) permitted non-monetized music video, including but not limited to film, television, commercials, video games, theatrical productions, or branded content;</w:t>
+        <w:t xml:space="preserve">Synchronize the Beat or the New Song with any audiovisual work other than the one (1) permitted non-monetized music video, including but not limited to film, television, commercials, video games, theatrical productions, or branded content (a separate sync license must be negotiated with the Licensor for any such use);</w:t>
       </w:r>
     </w:p>
     <w:p>
@@ -1020,6 +1037,34 @@
           <w:szCs w:val="21"/>
         </w:rPr>
         <w:t xml:space="preserve">If the Licensee registers the New Song with a Performing Rights Organization (PRO) such as ASCAP, BMI, SESAC, or any foreign equivalent, the Licensee must simultaneously register the Licensor’s writer share and publisher share as set forth above, and must identify the Licensor as a co-writer of the underlying composition.</w:t>
+      </w:r>
+    </w:p>
+    <w:p>
+      <w:pPr>
+        <w:spacing w:after="160" w:line="276"/>
+        <w:jc w:val="both"/>
+      </w:pPr>
+      <w:r>
+        <w:rPr>
+          <w:rFonts w:ascii="Calibri" w:cs="Calibri" w:eastAsia="Calibri" w:hAnsi="Calibri"/>
+          <w:b/>
+          <w:bCs/>
+          <w:color w:val="1A1A1A"/>
+          <w:sz w:val="21"/>
+          <w:szCs w:val="21"/>
+        </w:rPr>
+        <w:t xml:space="preserve">Licensor Registration Information.</w:t>
+      </w:r>
+      <w:r>
+        <w:rPr>
+          <w:rFonts w:ascii="Calibri" w:cs="Calibri" w:eastAsia="Calibri" w:hAnsi="Calibri"/>
+          <w:b w:val="false"/>
+          <w:bCs w:val="false"/>
+          <w:color w:val="1A1A1A"/>
+          <w:sz w:val="21"/>
+          <w:szCs w:val="21"/>
+        </w:rPr>
+        <w:t xml:space="preserve"> For the purpose of registering the Licensor’s share of the underlying composition with any PRO, distributor, or rights administrator, the Licensor’s information is: Legal Name: Owen Hucal, professionally known as prod.essential; Performing Rights Organization: ASCAP; Writer IPI/CAE Number: [WRITER_IPI]; Publishing Company: prod.essential Publishing; Publisher IPI/CAE Number: 1358011863. When registering the New Song with any PRO, distributor, or rights administrator, the Licensee must list the Licensor as a co-writer using this information.</w:t>
       </w:r>
     </w:p>
     <w:p>

</xml_diff>

<commit_message>
Fix license contradictions and sync on-site text with PDFs
- Publisher's Share changed to 50/50 (was 100% to Licensor, contradicting
  the 50% co-writer mechanical royalty language) in Basic, Premium,
  Premium+Stems, and Unlimited, matching the Exclusive license.
- Warranty section now opens with "Except as expressly stated below" so
  the as-is disclaimer no longer contradicts the sample-clearance and
  authority warranties in the same section.
- Writer IPI placeholder now carries an inline reminder tag until ASCAP
  issues the number.
- Removed a stray caps reference left over from the Unlimited tier, which
  has no distribution/streaming caps.
- lib/licenseTexts.ts (on-site license modal) brought back in sync with
  the .docx files, verified line-for-line against each tier.
</commit_message>
<xml_diff>
--- a/public/licenses/basic-mp3-license.docx
+++ b/public/licenses/basic-mp3-license.docx
@@ -1019,7 +1019,7 @@
           <w:sz w:val="21"/>
           <w:szCs w:val="21"/>
         </w:rPr>
-        <w:t xml:space="preserve"> One hundred percent (100%) to the Licensor.</w:t>
+        <w:t xml:space="preserve"> Fifty percent (50%) to the Licensor; fifty percent (50%) to the Licensee. Each party is responsible for administering its own publisher’s share.</w:t>
       </w:r>
     </w:p>
     <w:p>
@@ -1064,7 +1064,7 @@
           <w:sz w:val="21"/>
           <w:szCs w:val="21"/>
         </w:rPr>
-        <w:t xml:space="preserve"> For the purpose of registering the Licensor’s share of the underlying composition with any PRO, distributor, or rights administrator, the Licensor’s information is: Legal Name: Owen Hucal, professionally known as prod.essential; Performing Rights Organization: ASCAP; Writer IPI/CAE Number: [WRITER_IPI]; Publishing Company: prod.essential Publishing; Publisher IPI/CAE Number: 1358011863. When registering the New Song with any PRO, distributor, or rights administrator, the Licensee must list the Licensor as a co-writer using this information.</w:t>
+        <w:t xml:space="preserve"> For the purpose of registering the Licensor’s share of the underlying composition with any PRO, distributor, or rights administrator, the Licensor’s information is: Legal Name: Owen Hucal, professionally known as prod.essential; Performing Rights Organization: ASCAP; Writer IPI/CAE Number: [WRITER_IPI] (REMINDER: INSERT ASCAP WRITER IPI ONCE RECEIVED); Publishing Company: prod.essential Publishing; Publisher IPI/CAE Number: 1358011863. When registering the New Song with any PRO, distributor, or rights administrator, the Licensee must list the Licensor as a co-writer using this information.</w:t>
       </w:r>
     </w:p>
     <w:p>
@@ -1197,7 +1197,7 @@
           <w:sz w:val="21"/>
           <w:szCs w:val="21"/>
         </w:rPr>
-        <w:t xml:space="preserve">The Beat is delivered “as is” without warranties of any kind, express or implied, including warranties of fitness for a particular purpose.</w:t>
+        <w:t xml:space="preserve">Except as expressly stated below, the Beat is delivered “as is” without warranties of any kind, express or implied, including warranties of fitness for a particular purpose.</w:t>
       </w:r>
     </w:p>
     <w:p>

</xml_diff>